<commit_message>
Fix #68/#79: exhibit renumbering sweep across GovGuard exhibits
Renumbered every sub-exhibit self-reference (EXHIBIT G-1 through G-11)
to the new flat scheme's sub-numbering (28.G1-28.G11, since GovGuard is
now Exhibit 28), and every "Exhibit 12.5" reference to "Exhibit 28"
across the main exhibit, its user summary, and all G1-G11 sub-exhibit
files (base + _TC where applicable).

Co-Authored-By: Claude Sonnet 5 <noreply@anthropic.com>
</commit_message>
<xml_diff>
--- a/12.5- G1-G9 Sub Exhibits Gov Guard/GovGuard_Exhibit_G11_Enterprise_Roadmap.docx
+++ b/12.5- G1-G9 Sub Exhibits Gov Guard/GovGuard_Exhibit_G11_Enterprise_Roadmap.docx
@@ -15,7 +15,7 @@
           <w:b/>
           <w:sz w:val="32"/>
         </w:rPr>
-        <w:t>EXHIBIT G-11</w:t>
+        <w:t>EXHIBIT 28.G11</w:t>
       </w:r>
     </w:p>
     <w:p>
@@ -261,7 +261,7 @@
             </w:r>
             <w:r>
               <w:lastRenderedPageBreak/>
-              <w:t>SC-8, SI-10 — see Exhibit G-9)</w:t>
+              <w:t>SC-8, SI-10 — see Exhibit 28.G9)</w:t>
             </w:r>
           </w:p>
         </w:tc>
@@ -309,7 +309,7 @@
           </w:tcPr>
           <w:p>
             <w:r>
-              <w:t>CM-006, CM-009, CM-010 require evaluation logic implementation (see Exhibit G-7)</w:t>
+              <w:t>CM-006, CM-009, CM-010 require evaluation logic implementation (see Exhibit 28.G7)</w:t>
             </w:r>
           </w:p>
         </w:tc>
@@ -331,7 +331,7 @@
           </w:tcPr>
           <w:p>
             <w:r>
-              <w:t>70-scenario GAO High-Risk test dataset (Exhibit G-4)</w:t>
+              <w:t>70-scenario GAO High-Risk test dataset (Exhibit 28.G4)</w:t>
             </w:r>
           </w:p>
         </w:tc>

</xml_diff>